<commit_message>
JHIR: add three-track (analytics/systems/human-centered) framing to intro; confirm numbered [n] reference style matches (no conversion); rebuild manuscript DOCX+PDF
JHIR reference style verified as numbered square-bracket [n] via Springer guidance = paper's existing style.
Co-Authored-By: Claude Opus 4.8 <noreply@anthropic.com>
</commit_message>
<xml_diff>
--- a/submission/JHIR/manuscript.docx
+++ b/submission/JHIR/manuscript.docx
@@ -898,7 +898,25 @@
         <w:t xml:space="preserve"> </w:t>
       </w:r>
       <w:r>
-        <w:t xml:space="preserve">patterns and open problems in an emergent field.</w:t>
+        <w:t xml:space="preserve">patterns and open problems in an emergent field. The work spans three concerns of healthcare informatics:</w:t>
+      </w:r>
+      <w:r>
+        <w:t xml:space="preserve"> </w:t>
+      </w:r>
+      <w:r>
+        <w:t xml:space="preserve">analytics, in the generative-AI and machine-learning methods used to produce and process clinical text;</w:t>
+      </w:r>
+      <w:r>
+        <w:t xml:space="preserve"> </w:t>
+      </w:r>
+      <w:r>
+        <w:t xml:space="preserve">systems, in building natural language processing for under-served communication channels; and</w:t>
+      </w:r>
+      <w:r>
+        <w:t xml:space="preserve"> </w:t>
+      </w:r>
+      <w:r>
+        <w:t xml:space="preserve">human-centered computing, in the clinician and patient communication these systems ultimately serve.</w:t>
       </w:r>
     </w:p>
     <w:p>

</xml_diff>